<commit_message>
Retitle Book Five to 'Veil Upon Veil' and align both blueprints
- v16 DOCX + EPUB retitled: main title 'Veil Upon Veil', subtitle 'The Ledger
  and the Well' (title page, EPUB dc:title main/subtitle refinements, NCX docTitle).
- New Arabia_Bk5_Blueprint_v2.docx: thorough Book Five blueprint reconciled with
  the v16 manuscript (title; ages incl. Talal d.1891; Faraj/Yaqut; two-camels
  resolution; veiling thread; Masmak POV; Doughty flash-forward; Blunt mediation;
  disciplined voice; full cast; 19 final chapter beats; objects; metrics; change
  history).
- New Arabia-Series-Blueprints_v2.pdf: series bible with an expanded Volume V
  section; series-wide corrections (Book Five title = Veil Upon Veil; Talal dies
  winter 1891, not c.1895).
All three now agree and do not contradict.

Co-authored-by: eddiegcs <eddiegcs@users.noreply.github.com>
</commit_message>
<xml_diff>
--- a/Arabia_Bk5_v16.docx
+++ b/Arabia_Bk5_v16.docx
@@ -42,6 +42,18 @@
           <w:bCs/>
           <w:sz w:val="54"/>
           <w:szCs w:val="54"/>
+        </w:rPr>
+        <w:t>Veil Upon Veil</w:t>
+      </w:r>
+    </w:p>
+    <w:p>
+      <w:pPr>
+        <w:jc w:val="center"/>
+      </w:pPr>
+      <w:r>
+        <w:rPr>
+          <w:i/>
+          <w:sz w:val="32"/>
         </w:rPr>
         <w:t>The Ledger and the Well</w:t>
       </w:r>

</xml_diff>